<commit_message>
Tài liệu yêu cầu Cổng Help: gửi góp ý / yêu cầu hỗ trợ chụp màn hình xong phải có trình sửa ảnh dạng Paint (khung, mũi tên, chữ, làm mờ) trước khi đính kèm
Co-Authored-By: Claude Fable 5.1 <noreply@anthropic.com>
</commit_message>
<xml_diff>
--- a/_v2/docs/Yeu_cau_Cong_Help_He_thong_Quan_tri_Dai_hoc_CHI_TIET_CO_SO_DO.docx
+++ b/_v2/docs/Yeu_cau_Cong_Help_He_thong_Quan_tri_Dai_hoc_CHI_TIET_CO_SO_DO.docx
@@ -2687,7 +2687,7 @@
                 <w:rFonts w:ascii="Arial" w:hAnsi="Arial" w:eastAsia="Arial"/>
                 <w:sz w:val="17"/>
               </w:rPr>
-              <w:t>Người dùng có thể đánh giá “Hữu ích/Không hữu ích”, gửi góp ý hoặc báo nội dung lỗi; chuyển thành nhiệm vụ cập nhật.</w:t>
+              <w:t>Người dùng có thể đánh giá “Hữu ích/Không hữu ích”, gửi góp ý hoặc báo nội dung lỗi; chuyển thành nhiệm vụ cập nhật. Nút gửi góp ý/yêu cầu hỗ trợ cho phép chụp màn hình đang xem ngay trong hộp gửi; chụp xong phải có nút sửa ảnh dạng Paint (đóng khung, vẽ mũi tên chỉ vào chỗ có vấn đề, ghi chữ, làm mờ thông tin nhạy cảm) trước khi đính kèm.</w:t>
             </w:r>
           </w:p>
         </w:tc>
@@ -13019,7 +13019,7 @@
                 <w:b w:val="0"/>
                 <w:sz w:val="15"/>
               </w:rPr>
-              <w:t>Topic, nội dung góp ý, ảnh tùy chọn.</w:t>
+              <w:t>Topic, nội dung góp ý, ảnh chụp màn hình tùy chọn (bản gốc và bản đã đánh dấu).</w:t>
             </w:r>
           </w:p>
         </w:tc>
@@ -13039,7 +13039,7 @@
                 <w:b w:val="0"/>
                 <w:sz w:val="15"/>
               </w:rPr>
-              <w:t>Tạo ticket phản hồi; chuyển người phụ trách; trạng thái Mới/Đang xử lý/Đã xử lý/Từ chối.</w:t>
+              <w:t>Nút chụp màn hình ngay trong hộp gửi; chụp xong mở trình sửa ảnh dạng Paint (khung chữ nhật, mũi tên, chữ, làm mờ) để người dùng khoanh vùng hoặc chỉ mũi tên vào chỗ có vấn đề rồi mới đính kèm; lưu cả ảnh gốc và ảnh đã đánh dấu. Tạo ticket phản hồi; chuyển người phụ trách; trạng thái Mới/Đang xử lý/Đã xử lý/Từ chối.</w:t>
             </w:r>
           </w:p>
         </w:tc>

</xml_diff>

<commit_message>
Thu về đúng yêu cầu: tài liệu nút Yêu cầu hỗ trợ chỉ thêm một dòng nút Sửa ảnh (khung / mũi tên) ở bước 2; hoàn lại tài liệu tổng _v2/docs
Co-Authored-By: Claude Fable 5.1 <noreply@anthropic.com>
</commit_message>
<xml_diff>
--- a/_v2/docs/Yeu_cau_Cong_Help_He_thong_Quan_tri_Dai_hoc_CHI_TIET_CO_SO_DO.docx
+++ b/_v2/docs/Yeu_cau_Cong_Help_He_thong_Quan_tri_Dai_hoc_CHI_TIET_CO_SO_DO.docx
@@ -2687,7 +2687,7 @@
                 <w:rFonts w:ascii="Arial" w:hAnsi="Arial" w:eastAsia="Arial"/>
                 <w:sz w:val="17"/>
               </w:rPr>
-              <w:t>Người dùng có thể đánh giá “Hữu ích/Không hữu ích”, gửi góp ý hoặc báo nội dung lỗi; chuyển thành nhiệm vụ cập nhật. Nút gửi góp ý/yêu cầu hỗ trợ cho phép chụp màn hình đang xem ngay trong hộp gửi; chụp xong phải có nút sửa ảnh dạng Paint (đóng khung, vẽ mũi tên chỉ vào chỗ có vấn đề, ghi chữ, làm mờ thông tin nhạy cảm) trước khi đính kèm.</w:t>
+              <w:t>Người dùng có thể đánh giá “Hữu ích/Không hữu ích”, gửi góp ý hoặc báo nội dung lỗi; chuyển thành nhiệm vụ cập nhật.</w:t>
             </w:r>
           </w:p>
         </w:tc>
@@ -13019,7 +13019,7 @@
                 <w:b w:val="0"/>
                 <w:sz w:val="15"/>
               </w:rPr>
-              <w:t>Topic, nội dung góp ý, ảnh chụp màn hình tùy chọn (bản gốc và bản đã đánh dấu).</w:t>
+              <w:t>Topic, nội dung góp ý, ảnh tùy chọn.</w:t>
             </w:r>
           </w:p>
         </w:tc>
@@ -13039,7 +13039,7 @@
                 <w:b w:val="0"/>
                 <w:sz w:val="15"/>
               </w:rPr>
-              <w:t>Nút chụp màn hình ngay trong hộp gửi; chụp xong mở trình sửa ảnh dạng Paint (khung chữ nhật, mũi tên, chữ, làm mờ) để người dùng khoanh vùng hoặc chỉ mũi tên vào chỗ có vấn đề rồi mới đính kèm; lưu cả ảnh gốc và ảnh đã đánh dấu. Tạo ticket phản hồi; chuyển người phụ trách; trạng thái Mới/Đang xử lý/Đã xử lý/Từ chối.</w:t>
+              <w:t>Tạo ticket phản hồi; chuyển người phụ trách; trạng thái Mới/Đang xử lý/Đã xử lý/Từ chối.</w:t>
             </w:r>
           </w:p>
         </w:tc>

</xml_diff>